<commit_message>
Fix SyntaxError: remove apostrophe from docstring path comment
PROF_DOMENICO'S -> PROF_DOMENICOS in docstring only (DATA_PATH var unchanged)

https://claude.ai/code/session_01Xn4r78vBrFCZ6GbaAGxtCS
</commit_message>
<xml_diff>
--- a/PLSDA_SVM_NoSplit_V2.docx
+++ b/PLSDA_SVM_NoSplit_V2.docx
@@ -21,7 +21,7 @@
         <w:rPr>
           <w:sz w:val="20"/>
         </w:rPr>
-        <w:t>SSY Raman Spectroscopy — 4-Class Classification</w:t>
+        <w:t>SSY Raman Spectroscopy - 4-Class Classification</w:t>
         <w:br/>
         <w:t>VIP top-2200  |  5-fold CV + LOO-CV  |  No train/test split</w:t>
         <w:br/>
@@ -43,6 +43,7 @@
       <w:r>
         <w:rPr>
           <w:rFonts w:ascii="Courier New" w:hAnsi="Courier New"/>
+          <w:sz w:val="18"/>
         </w:rPr>
         <w:t>pip install pandas openpyxl scikit-learn scipy matplotlib xlrd</w:t>
         <w:br/>
@@ -50,732 +51,9 @@
       <w:r>
         <w:rPr>
           <w:rFonts w:ascii="Courier New" w:hAnsi="Courier New"/>
+          <w:sz w:val="18"/>
         </w:rPr>
         <w:t>python PLSDA_SVM_NoSplit_V2.py</w:t>
-        <w:br/>
-      </w:r>
-    </w:p>
-    <w:p/>
-    <w:p>
-      <w:pPr>
-        <w:pStyle w:val="Heading2"/>
-      </w:pPr>
-      <w:r>
-        <w:t>Key Changes from Previous Version</w:t>
-      </w:r>
-    </w:p>
-    <w:p>
-      <w:r>
-        <w:rPr>
-          <w:b/>
-        </w:rPr>
-        <w:t>1. VIP_TOP_N changed: 1800 -&gt; 2200</w:t>
-        <w:br/>
-      </w:r>
-      <w:r>
-        <w:rPr>
-          <w:b/>
-        </w:rPr>
-        <w:t>2. NEW: Accuracy Matrix plots (Figs 05,06,14,15) — raw counts, overall accuracy</w:t>
-        <w:br/>
-      </w:r>
-      <w:r>
-        <w:rPr>
-          <w:b/>
-        </w:rPr>
-        <w:t>3. NEW: Recall Matrix plots (Figs 07,08,16,17) — row-normalised, diagonal = recall per class</w:t>
-        <w:br/>
-      </w:r>
-      <w:r>
-        <w:rPr>
-          <w:b/>
-        </w:rPr>
-        <w:t>4. Excel: 8 CM sheets (4 accuracy + 4 recall), per-class recall table</w:t>
-        <w:br/>
-      </w:r>
-    </w:p>
-    <w:p/>
-    <w:p>
-      <w:pPr>
-        <w:pStyle w:val="Heading2"/>
-      </w:pPr>
-      <w:r>
-        <w:t>Output Files (20 figures + Excel)</w:t>
-      </w:r>
-    </w:p>
-    <w:tbl>
-      <w:tblPr>
-        <w:tblStyle w:val="LightList-Accent1"/>
-        <w:tblW w:type="auto" w:w="0"/>
-        <w:tblLook w:firstColumn="1" w:firstRow="1" w:lastColumn="0" w:lastRow="0" w:noHBand="0" w:noVBand="1" w:val="04A0"/>
-      </w:tblPr>
-      <w:tblGrid>
-        <w:gridCol w:w="4320"/>
-        <w:gridCol w:w="4320"/>
-      </w:tblGrid>
-      <w:tr>
-        <w:tc>
-          <w:tcPr>
-            <w:tcW w:type="dxa" w:w="4320"/>
-          </w:tcPr>
-          <w:p>
-            <w:r>
-              <w:t>Filename</w:t>
-            </w:r>
-          </w:p>
-        </w:tc>
-        <w:tc>
-          <w:tcPr>
-            <w:tcW w:type="dxa" w:w="4320"/>
-          </w:tcPr>
-          <w:p>
-            <w:r>
-              <w:t>Description</w:t>
-            </w:r>
-          </w:p>
-        </w:tc>
-      </w:tr>
-      <w:tr>
-        <w:tc>
-          <w:tcPr>
-            <w:tcW w:type="dxa" w:w="4320"/>
-          </w:tcPr>
-          <w:p>
-            <w:r>
-              <w:rPr>
-                <w:sz w:val="18"/>
-              </w:rPr>
-              <w:t>01_PLSDA_Scores_LV1_LV2.png</w:t>
-            </w:r>
-          </w:p>
-        </w:tc>
-        <w:tc>
-          <w:tcPr>
-            <w:tcW w:type="dxa" w:w="4320"/>
-          </w:tcPr>
-          <w:p>
-            <w:r>
-              <w:rPr>
-                <w:sz w:val="18"/>
-              </w:rPr>
-              <w:t>PLS-DA score plot LV1 x LV2</w:t>
-            </w:r>
-          </w:p>
-        </w:tc>
-      </w:tr>
-      <w:tr>
-        <w:tc>
-          <w:tcPr>
-            <w:tcW w:type="dxa" w:w="4320"/>
-          </w:tcPr>
-          <w:p>
-            <w:r>
-              <w:rPr>
-                <w:sz w:val="18"/>
-              </w:rPr>
-              <w:t>02_PLSDA_Scores_LV1_LV3.png</w:t>
-            </w:r>
-          </w:p>
-        </w:tc>
-        <w:tc>
-          <w:tcPr>
-            <w:tcW w:type="dxa" w:w="4320"/>
-          </w:tcPr>
-          <w:p>
-            <w:r>
-              <w:rPr>
-                <w:sz w:val="18"/>
-              </w:rPr>
-              <w:t>PLS-DA score plot LV1 x LV3</w:t>
-            </w:r>
-          </w:p>
-        </w:tc>
-      </w:tr>
-      <w:tr>
-        <w:tc>
-          <w:tcPr>
-            <w:tcW w:type="dxa" w:w="4320"/>
-          </w:tcPr>
-          <w:p>
-            <w:r>
-              <w:rPr>
-                <w:sz w:val="18"/>
-              </w:rPr>
-              <w:t>03_PLSDA_Scores_LV2_LV3.png</w:t>
-            </w:r>
-          </w:p>
-        </w:tc>
-        <w:tc>
-          <w:tcPr>
-            <w:tcW w:type="dxa" w:w="4320"/>
-          </w:tcPr>
-          <w:p>
-            <w:r>
-              <w:rPr>
-                <w:sz w:val="18"/>
-              </w:rPr>
-              <w:t>PLS-DA score plot LV2 x LV3</w:t>
-            </w:r>
-          </w:p>
-        </w:tc>
-      </w:tr>
-      <w:tr>
-        <w:tc>
-          <w:tcPr>
-            <w:tcW w:type="dxa" w:w="4320"/>
-          </w:tcPr>
-          <w:p>
-            <w:r>
-              <w:rPr>
-                <w:sz w:val="18"/>
-              </w:rPr>
-              <w:t>04_PLSDA_Scores_3D.png</w:t>
-            </w:r>
-          </w:p>
-        </w:tc>
-        <w:tc>
-          <w:tcPr>
-            <w:tcW w:type="dxa" w:w="4320"/>
-          </w:tcPr>
-          <w:p>
-            <w:r>
-              <w:rPr>
-                <w:sz w:val="18"/>
-              </w:rPr>
-              <w:t>PLS-DA 3D score plot</w:t>
-            </w:r>
-          </w:p>
-        </w:tc>
-      </w:tr>
-      <w:tr>
-        <w:tc>
-          <w:tcPr>
-            <w:tcW w:type="dxa" w:w="4320"/>
-          </w:tcPr>
-          <w:p>
-            <w:r>
-              <w:rPr>
-                <w:sz w:val="18"/>
-              </w:rPr>
-              <w:t>05_PLSDA_Accuracy_Matrix_5fold.png</w:t>
-            </w:r>
-          </w:p>
-        </w:tc>
-        <w:tc>
-          <w:tcPr>
-            <w:tcW w:type="dxa" w:w="4320"/>
-          </w:tcPr>
-          <w:p>
-            <w:r>
-              <w:rPr>
-                <w:sz w:val="18"/>
-              </w:rPr>
-              <w:t>ACCURACY matrix — raw counts — 5-fold CV</w:t>
-            </w:r>
-          </w:p>
-        </w:tc>
-      </w:tr>
-      <w:tr>
-        <w:tc>
-          <w:tcPr>
-            <w:tcW w:type="dxa" w:w="4320"/>
-          </w:tcPr>
-          <w:p>
-            <w:r>
-              <w:rPr>
-                <w:sz w:val="18"/>
-              </w:rPr>
-              <w:t>06_PLSDA_Accuracy_Matrix_LOO.png</w:t>
-            </w:r>
-          </w:p>
-        </w:tc>
-        <w:tc>
-          <w:tcPr>
-            <w:tcW w:type="dxa" w:w="4320"/>
-          </w:tcPr>
-          <w:p>
-            <w:r>
-              <w:rPr>
-                <w:sz w:val="18"/>
-              </w:rPr>
-              <w:t>ACCURACY matrix — raw counts — LOO-CV</w:t>
-            </w:r>
-          </w:p>
-        </w:tc>
-      </w:tr>
-      <w:tr>
-        <w:tc>
-          <w:tcPr>
-            <w:tcW w:type="dxa" w:w="4320"/>
-          </w:tcPr>
-          <w:p>
-            <w:r>
-              <w:rPr>
-                <w:sz w:val="18"/>
-              </w:rPr>
-              <w:t>07_PLSDA_Recall_Matrix_5fold.png</w:t>
-            </w:r>
-          </w:p>
-        </w:tc>
-        <w:tc>
-          <w:tcPr>
-            <w:tcW w:type="dxa" w:w="4320"/>
-          </w:tcPr>
-          <w:p>
-            <w:r>
-              <w:rPr>
-                <w:sz w:val="18"/>
-              </w:rPr>
-              <w:t>RECALL matrix — row-normalised — 5-fold CV</w:t>
-            </w:r>
-          </w:p>
-        </w:tc>
-      </w:tr>
-      <w:tr>
-        <w:tc>
-          <w:tcPr>
-            <w:tcW w:type="dxa" w:w="4320"/>
-          </w:tcPr>
-          <w:p>
-            <w:r>
-              <w:rPr>
-                <w:sz w:val="18"/>
-              </w:rPr>
-              <w:t>08_PLSDA_Recall_Matrix_LOO.png</w:t>
-            </w:r>
-          </w:p>
-        </w:tc>
-        <w:tc>
-          <w:tcPr>
-            <w:tcW w:type="dxa" w:w="4320"/>
-          </w:tcPr>
-          <w:p>
-            <w:r>
-              <w:rPr>
-                <w:sz w:val="18"/>
-              </w:rPr>
-              <w:t>RECALL matrix — row-normalised — LOO-CV</w:t>
-            </w:r>
-          </w:p>
-        </w:tc>
-      </w:tr>
-      <w:tr>
-        <w:tc>
-          <w:tcPr>
-            <w:tcW w:type="dxa" w:w="4320"/>
-          </w:tcPr>
-          <w:p>
-            <w:r>
-              <w:rPr>
-                <w:sz w:val="18"/>
-              </w:rPr>
-              <w:t>09_PLSDA_VIP_Scores.png</w:t>
-            </w:r>
-          </w:p>
-        </w:tc>
-        <w:tc>
-          <w:tcPr>
-            <w:tcW w:type="dxa" w:w="4320"/>
-          </w:tcPr>
-          <w:p>
-            <w:r>
-              <w:rPr>
-                <w:sz w:val="18"/>
-              </w:rPr>
-              <w:t>VIP scores (top-2200 highlighted)</w:t>
-            </w:r>
-          </w:p>
-        </w:tc>
-      </w:tr>
-      <w:tr>
-        <w:tc>
-          <w:tcPr>
-            <w:tcW w:type="dxa" w:w="4320"/>
-          </w:tcPr>
-          <w:p>
-            <w:r>
-              <w:rPr>
-                <w:sz w:val="18"/>
-              </w:rPr>
-              <w:t>10_PLSDA_Loadings.png</w:t>
-            </w:r>
-          </w:p>
-        </w:tc>
-        <w:tc>
-          <w:tcPr>
-            <w:tcW w:type="dxa" w:w="4320"/>
-          </w:tcPr>
-          <w:p>
-            <w:r>
-              <w:rPr>
-                <w:sz w:val="18"/>
-              </w:rPr>
-              <w:t>PLS-DA loadings LV1/LV2/LV3</w:t>
-            </w:r>
-          </w:p>
-        </w:tc>
-      </w:tr>
-      <w:tr>
-        <w:tc>
-          <w:tcPr>
-            <w:tcW w:type="dxa" w:w="4320"/>
-          </w:tcPr>
-          <w:p>
-            <w:r>
-              <w:rPr>
-                <w:sz w:val="18"/>
-              </w:rPr>
-              <w:t>11_PLSDA_Permutation.png</w:t>
-            </w:r>
-          </w:p>
-        </w:tc>
-        <w:tc>
-          <w:tcPr>
-            <w:tcW w:type="dxa" w:w="4320"/>
-          </w:tcPr>
-          <w:p>
-            <w:r>
-              <w:rPr>
-                <w:sz w:val="18"/>
-              </w:rPr>
-              <w:t>Permutation test (999 permutations)</w:t>
-            </w:r>
-          </w:p>
-        </w:tc>
-      </w:tr>
-      <w:tr>
-        <w:tc>
-          <w:tcPr>
-            <w:tcW w:type="dxa" w:w="4320"/>
-          </w:tcPr>
-          <w:p>
-            <w:r>
-              <w:rPr>
-                <w:sz w:val="18"/>
-              </w:rPr>
-              <w:t>12_SVM_Cluster_5fold.png</w:t>
-            </w:r>
-          </w:p>
-        </w:tc>
-        <w:tc>
-          <w:tcPr>
-            <w:tcW w:type="dxa" w:w="4320"/>
-          </w:tcPr>
-          <w:p>
-            <w:r>
-              <w:rPr>
-                <w:sz w:val="18"/>
-              </w:rPr>
-              <w:t>SVM-RBF cluster plot — 5-fold CV (PCA space)</w:t>
-            </w:r>
-          </w:p>
-        </w:tc>
-      </w:tr>
-      <w:tr>
-        <w:tc>
-          <w:tcPr>
-            <w:tcW w:type="dxa" w:w="4320"/>
-          </w:tcPr>
-          <w:p>
-            <w:r>
-              <w:rPr>
-                <w:sz w:val="18"/>
-              </w:rPr>
-              <w:t>13_SVM_Cluster_LOO.png</w:t>
-            </w:r>
-          </w:p>
-        </w:tc>
-        <w:tc>
-          <w:tcPr>
-            <w:tcW w:type="dxa" w:w="4320"/>
-          </w:tcPr>
-          <w:p>
-            <w:r>
-              <w:rPr>
-                <w:sz w:val="18"/>
-              </w:rPr>
-              <w:t>SVM-RBF cluster plot — LOO-CV (PCA space)</w:t>
-            </w:r>
-          </w:p>
-        </w:tc>
-      </w:tr>
-      <w:tr>
-        <w:tc>
-          <w:tcPr>
-            <w:tcW w:type="dxa" w:w="4320"/>
-          </w:tcPr>
-          <w:p>
-            <w:r>
-              <w:rPr>
-                <w:sz w:val="18"/>
-              </w:rPr>
-              <w:t>14_SVM_Accuracy_Matrix_5fold.png</w:t>
-            </w:r>
-          </w:p>
-        </w:tc>
-        <w:tc>
-          <w:tcPr>
-            <w:tcW w:type="dxa" w:w="4320"/>
-          </w:tcPr>
-          <w:p>
-            <w:r>
-              <w:rPr>
-                <w:sz w:val="18"/>
-              </w:rPr>
-              <w:t>SVM ACCURACY matrix — raw counts — 5-fold CV</w:t>
-            </w:r>
-          </w:p>
-        </w:tc>
-      </w:tr>
-      <w:tr>
-        <w:tc>
-          <w:tcPr>
-            <w:tcW w:type="dxa" w:w="4320"/>
-          </w:tcPr>
-          <w:p>
-            <w:r>
-              <w:rPr>
-                <w:sz w:val="18"/>
-              </w:rPr>
-              <w:t>15_SVM_Accuracy_Matrix_LOO.png</w:t>
-            </w:r>
-          </w:p>
-        </w:tc>
-        <w:tc>
-          <w:tcPr>
-            <w:tcW w:type="dxa" w:w="4320"/>
-          </w:tcPr>
-          <w:p>
-            <w:r>
-              <w:rPr>
-                <w:sz w:val="18"/>
-              </w:rPr>
-              <w:t>SVM ACCURACY matrix — raw counts — LOO-CV</w:t>
-            </w:r>
-          </w:p>
-        </w:tc>
-      </w:tr>
-      <w:tr>
-        <w:tc>
-          <w:tcPr>
-            <w:tcW w:type="dxa" w:w="4320"/>
-          </w:tcPr>
-          <w:p>
-            <w:r>
-              <w:rPr>
-                <w:sz w:val="18"/>
-              </w:rPr>
-              <w:t>16_SVM_Recall_Matrix_5fold.png</w:t>
-            </w:r>
-          </w:p>
-        </w:tc>
-        <w:tc>
-          <w:tcPr>
-            <w:tcW w:type="dxa" w:w="4320"/>
-          </w:tcPr>
-          <w:p>
-            <w:r>
-              <w:rPr>
-                <w:sz w:val="18"/>
-              </w:rPr>
-              <w:t>SVM RECALL matrix — row-normalised — 5-fold CV</w:t>
-            </w:r>
-          </w:p>
-        </w:tc>
-      </w:tr>
-      <w:tr>
-        <w:tc>
-          <w:tcPr>
-            <w:tcW w:type="dxa" w:w="4320"/>
-          </w:tcPr>
-          <w:p>
-            <w:r>
-              <w:rPr>
-                <w:sz w:val="18"/>
-              </w:rPr>
-              <w:t>17_SVM_Recall_Matrix_LOO.png</w:t>
-            </w:r>
-          </w:p>
-        </w:tc>
-        <w:tc>
-          <w:tcPr>
-            <w:tcW w:type="dxa" w:w="4320"/>
-          </w:tcPr>
-          <w:p>
-            <w:r>
-              <w:rPr>
-                <w:sz w:val="18"/>
-              </w:rPr>
-              <w:t>SVM RECALL matrix — row-normalised — LOO-CV</w:t>
-            </w:r>
-          </w:p>
-        </w:tc>
-      </w:tr>
-      <w:tr>
-        <w:tc>
-          <w:tcPr>
-            <w:tcW w:type="dxa" w:w="4320"/>
-          </w:tcPr>
-          <w:p>
-            <w:r>
-              <w:rPr>
-                <w:sz w:val="18"/>
-              </w:rPr>
-              <w:t>18_Accuracy_Comparison.png</w:t>
-            </w:r>
-          </w:p>
-        </w:tc>
-        <w:tc>
-          <w:tcPr>
-            <w:tcW w:type="dxa" w:w="4320"/>
-          </w:tcPr>
-          <w:p>
-            <w:r>
-              <w:rPr>
-                <w:sz w:val="18"/>
-              </w:rPr>
-              <w:t>Overall accuracy bar chart: PLS-DA vs SVM-RBF</w:t>
-            </w:r>
-          </w:p>
-        </w:tc>
-      </w:tr>
-      <w:tr>
-        <w:tc>
-          <w:tcPr>
-            <w:tcW w:type="dxa" w:w="4320"/>
-          </w:tcPr>
-          <w:p>
-            <w:r>
-              <w:rPr>
-                <w:sz w:val="18"/>
-              </w:rPr>
-              <w:t>19_Recall_Comparison.png</w:t>
-            </w:r>
-          </w:p>
-        </w:tc>
-        <w:tc>
-          <w:tcPr>
-            <w:tcW w:type="dxa" w:w="4320"/>
-          </w:tcPr>
-          <w:p>
-            <w:r>
-              <w:rPr>
-                <w:sz w:val="18"/>
-              </w:rPr>
-              <w:t>Per-class recall bar chart (2-panel)</w:t>
-            </w:r>
-          </w:p>
-        </w:tc>
-      </w:tr>
-      <w:tr>
-        <w:tc>
-          <w:tcPr>
-            <w:tcW w:type="dxa" w:w="4320"/>
-          </w:tcPr>
-          <w:p>
-            <w:r>
-              <w:rPr>
-                <w:sz w:val="18"/>
-              </w:rPr>
-              <w:t>20_Mean_Spectra.png</w:t>
-            </w:r>
-          </w:p>
-        </w:tc>
-        <w:tc>
-          <w:tcPr>
-            <w:tcW w:type="dxa" w:w="4320"/>
-          </w:tcPr>
-          <w:p>
-            <w:r>
-              <w:rPr>
-                <w:sz w:val="18"/>
-              </w:rPr>
-              <w:t>Mean Raman spectra +/- 1 SD</w:t>
-            </w:r>
-          </w:p>
-        </w:tc>
-      </w:tr>
-      <w:tr>
-        <w:tc>
-          <w:tcPr>
-            <w:tcW w:type="dxa" w:w="4320"/>
-          </w:tcPr>
-          <w:p>
-            <w:r>
-              <w:rPr>
-                <w:sz w:val="18"/>
-              </w:rPr>
-              <w:t>Results_NoSplit.xlsx</w:t>
-            </w:r>
-          </w:p>
-        </w:tc>
-        <w:tc>
-          <w:tcPr>
-            <w:tcW w:type="dxa" w:w="4320"/>
-          </w:tcPr>
-          <w:p>
-            <w:r>
-              <w:rPr>
-                <w:sz w:val="18"/>
-              </w:rPr>
-              <w:t>Excel: Summary + 8 CM sheets + VIP + Loadings + Permutation</w:t>
-            </w:r>
-          </w:p>
-        </w:tc>
-      </w:tr>
-    </w:tbl>
-    <w:p/>
-    <w:p>
-      <w:pPr>
-        <w:pStyle w:val="Heading2"/>
-      </w:pPr>
-      <w:r>
-        <w:t>Difference: Accuracy Matrix vs Recall Matrix</w:t>
-      </w:r>
-    </w:p>
-    <w:p>
-      <w:r>
-        <w:rPr>
-          <w:b/>
-        </w:rPr>
-        <w:t>Accuracy Matrix (Figs 05,06,14,15):</w:t>
-        <w:br/>
-      </w:r>
-      <w:r>
-        <w:t xml:space="preserve">  - Cells show RAW COUNTS (number of samples)</w:t>
-        <w:br/>
-      </w:r>
-      <w:r>
-        <w:t xml:space="preserve">  - Diagonal sum / total = overall accuracy</w:t>
-        <w:br/>
-      </w:r>
-      <w:r>
-        <w:t xml:space="preserve">  - Formula: no normalisation applied</w:t>
-        <w:br/>
-        <w:br/>
-      </w:r>
-      <w:r>
-        <w:rPr>
-          <w:b/>
-        </w:rPr>
-        <w:t>Recall Matrix (Figs 07,08,16,17):</w:t>
-        <w:br/>
-      </w:r>
-      <w:r>
-        <w:t xml:space="preserve">  - Cells show FRACTION (row-normalised)</w:t>
-        <w:br/>
-      </w:r>
-      <w:r>
-        <w:t xml:space="preserve">  - Diagonal value = Recall per class = TP / (TP + FN)</w:t>
-        <w:br/>
-      </w:r>
-      <w:r>
-        <w:t xml:space="preserve">  - Each cell also shows raw count in brackets</w:t>
-        <w:br/>
-      </w:r>
-      <w:r>
-        <w:t xml:space="preserve">  - Right-side annotation: Recall % per class</w:t>
-        <w:br/>
       </w:r>
     </w:p>
     <w:p/>
@@ -895,7 +173,7 @@
           <w:rFonts w:ascii="Courier New" w:hAnsi="Courier New"/>
           <w:sz w:val="15"/>
         </w:rPr>
-        <w:t>OUTPUTS -&gt; C:/Users/Hira Aman/Desktop/PROF_DOMENICO'S/PLSDA_SVM_NoSplit/</w:t>
+        <w:t>OUTPUTS -&gt; C:/Users/Hira Aman/Desktop/PROF_DOMENICOS/PLSDA_SVM_NoSplit/</w:t>
         <w:br/>
       </w:r>
       <w:r>

</xml_diff>